<commit_message>
chore: replace resume George_Brooks_Resume_Delivery_Management.docx
</commit_message>
<xml_diff>
--- a/public/resumes/George_Brooks_Resume_Delivery_Management.docx
+++ b/public/resumes/George_Brooks_Resume_Delivery_Management.docx
@@ -24,58 +24,12 @@
         <w:spacing w:after="60"/>
         <w:jc w:val="center"/>
       </w:pPr>
-      <w:proofErr w:type="gramStart"/>
       <w:r>
         <w:rPr>
           <w:rFonts w:ascii="Arial" w:eastAsia="Arial" w:hAnsi="Arial" w:cs="Arial"/>
           <w:color w:val="555555"/>
         </w:rPr>
-        <w:t>617.785.3853  |</w:t>
-      </w:r>
-      <w:proofErr w:type="gramEnd"/>
-      <w:r>
-        <w:rPr>
-          <w:rFonts w:ascii="Arial" w:eastAsia="Arial" w:hAnsi="Arial" w:cs="Arial"/>
-          <w:color w:val="555555"/>
-        </w:rPr>
-        <w:t xml:space="preserve">  </w:t>
-      </w:r>
-      <w:proofErr w:type="gramStart"/>
-      <w:r>
-        <w:rPr>
-          <w:rFonts w:ascii="Arial" w:eastAsia="Arial" w:hAnsi="Arial" w:cs="Arial"/>
-          <w:color w:val="555555"/>
-        </w:rPr>
-        <w:t>ghbrooks4@gmail.com  |</w:t>
-      </w:r>
-      <w:proofErr w:type="gramEnd"/>
-      <w:r>
-        <w:rPr>
-          <w:rFonts w:ascii="Arial" w:eastAsia="Arial" w:hAnsi="Arial" w:cs="Arial"/>
-          <w:color w:val="555555"/>
-        </w:rPr>
-        <w:t xml:space="preserve">  </w:t>
-      </w:r>
-      <w:r>
-        <w:rPr>
-          <w:rFonts w:ascii="Arial" w:eastAsia="Arial" w:hAnsi="Arial" w:cs="Arial"/>
-          <w:color w:val="555555"/>
-        </w:rPr>
-        <w:t>www.</w:t>
-      </w:r>
-      <w:r>
-        <w:rPr>
-          <w:rFonts w:ascii="Arial" w:eastAsia="Arial" w:hAnsi="Arial" w:cs="Arial"/>
-          <w:color w:val="555555"/>
-        </w:rPr>
-        <w:t>linkedin.com/in/</w:t>
-      </w:r>
-      <w:r>
-        <w:rPr>
-          <w:rFonts w:ascii="Arial" w:eastAsia="Arial" w:hAnsi="Arial" w:cs="Arial"/>
-          <w:color w:val="555555"/>
-        </w:rPr>
-        <w:t>ghbrooks</w:t>
+        <w:t>617.785.3853  |  ghbrooks4@gmail.com  |  www.linkedin.com/in/ghbrooks</w:t>
       </w:r>
     </w:p>
     <w:p>
@@ -111,56 +65,7 @@
           <w:rFonts w:ascii="Arial" w:eastAsia="Arial" w:hAnsi="Arial" w:cs="Arial"/>
           <w:color w:val="222222"/>
         </w:rPr>
-        <w:t xml:space="preserve">Strategic program and project management executive with </w:t>
-      </w:r>
-      <w:r>
-        <w:rPr>
-          <w:rFonts w:ascii="Arial" w:eastAsia="Arial" w:hAnsi="Arial" w:cs="Arial"/>
-          <w:color w:val="222222"/>
-        </w:rPr>
-        <w:t>14</w:t>
-      </w:r>
-      <w:r>
-        <w:rPr>
-          <w:rFonts w:ascii="Arial" w:eastAsia="Arial" w:hAnsi="Arial" w:cs="Arial"/>
-          <w:color w:val="222222"/>
-        </w:rPr>
-        <w:t xml:space="preserve">+ years leading complex, multi-workstream engagements across financial services, federal government, and enterprise technology. Expert in end-to-end program management </w:t>
-      </w:r>
-      <w:r>
-        <w:rPr>
-          <w:rFonts w:ascii="Arial" w:eastAsia="Arial" w:hAnsi="Arial" w:cs="Arial"/>
-          <w:color w:val="222222"/>
-        </w:rPr>
-        <w:t>-</w:t>
-      </w:r>
-      <w:r>
-        <w:rPr>
-          <w:rFonts w:ascii="Arial" w:eastAsia="Arial" w:hAnsi="Arial" w:cs="Arial"/>
-          <w:color w:val="222222"/>
-        </w:rPr>
-        <w:t xml:space="preserve"> from implementation planning through stakeholder engagement, monitoring, evaluation, and reporting. Proven track record delivering $50M+ transformation programs, regulatory compliance initiatives, and public sector consulting engagements at Deloitte, Capco, JPMC, and the IRS. PMP-certified (exp. June 2026), CSM, SAFe POPM</w:t>
-      </w:r>
-      <w:r>
-        <w:rPr>
-          <w:rFonts w:ascii="Arial" w:eastAsia="Arial" w:hAnsi="Arial" w:cs="Arial"/>
-          <w:color w:val="222222"/>
-        </w:rPr>
-        <w:t xml:space="preserve">. </w:t>
-      </w:r>
-      <w:r>
-        <w:rPr>
-          <w:rFonts w:ascii="Arial" w:eastAsia="Arial" w:hAnsi="Arial" w:cs="Arial"/>
-          <w:color w:val="222222"/>
-        </w:rPr>
-        <w:t>Remote-team leader with a record of C-suite</w:t>
-      </w:r>
-      <w:r>
-        <w:rPr>
-          <w:rFonts w:ascii="Arial" w:eastAsia="Arial" w:hAnsi="Arial" w:cs="Arial"/>
-          <w:color w:val="222222"/>
-        </w:rPr>
-        <w:t xml:space="preserve"> cross-functional delivery excellence.</w:t>
+        <w:t>Strategic program and project management professional with 14+ years of experience in digital marketing operations, project management, and analytical problem-solving across professional services, financial services, federal government, and enterprise technology. Expert in creating and adhering to project management processes — from implementation planning through stakeholder engagement, monitoring, evaluation, and reporting. Proven track record delivering $50M+ transformation programs at Deloitte, Capco, JPMC, and the IRS, with exceptional written, oral, interpersonal, and presentation communication skills. Self-starter with demonstrated ability to work independently and across cross-functional teams in fast-paced professional services environments.</w:t>
       </w:r>
     </w:p>
     <w:p>
@@ -206,7 +111,7 @@
           <w:sz w:val="19"/>
           <w:szCs w:val="19"/>
         </w:rPr>
-        <w:t>Monitoring, Evaluation &amp; Reporting   ·   Communications Planning   ·</w:t>
+        <w:t>Monitoring, Evaluation &amp; Reporting   ·   Communications Planning   ·   Digital Marketing Operations   ·   MS Office</w:t>
       </w:r>
     </w:p>
     <w:p>
@@ -271,39 +176,14 @@
           <w:sz w:val="22"/>
           <w:szCs w:val="22"/>
         </w:rPr>
-        <w:t xml:space="preserve">Supply </w:t>
-      </w:r>
-      <w:r>
-        <w:rPr>
-          <w:rFonts w:ascii="Arial" w:eastAsia="Arial" w:hAnsi="Arial" w:cs="Arial"/>
-          <w:b/>
-          <w:bCs/>
-          <w:color w:val="000000"/>
-          <w:sz w:val="22"/>
-          <w:szCs w:val="22"/>
-        </w:rPr>
-        <w:t>Bistro</w:t>
+        <w:t>Supply Bistro</w:t>
       </w:r>
       <w:r>
         <w:rPr>
           <w:rFonts w:ascii="Arial" w:eastAsia="Arial" w:hAnsi="Arial" w:cs="Arial"/>
           <w:color w:val="555555"/>
         </w:rPr>
-        <w:t xml:space="preserve"> </w:t>
-      </w:r>
-      <w:r>
-        <w:rPr>
-          <w:rFonts w:ascii="Arial" w:eastAsia="Arial" w:hAnsi="Arial" w:cs="Arial"/>
-          <w:color w:val="555555"/>
-        </w:rPr>
-        <w:t>| Houston</w:t>
-      </w:r>
-      <w:r>
-        <w:rPr>
-          <w:rFonts w:ascii="Arial" w:eastAsia="Arial" w:hAnsi="Arial" w:cs="Arial"/>
-          <w:color w:val="555555"/>
-        </w:rPr>
-        <w:t>, TX</w:t>
+        <w:t xml:space="preserve"> | Houston, TX</w:t>
       </w:r>
       <w:r>
         <w:rPr>
@@ -346,7 +226,7 @@
           <w:rFonts w:ascii="Arial" w:eastAsia="Arial" w:hAnsi="Arial" w:cs="Arial"/>
           <w:color w:val="222222"/>
         </w:rPr>
-        <w:t>Directed program management and test strategy governance across 3 concurrent product workstreams, establishing SDLC standards and implementation frameworks that reduced defect escape rate ~20% and delivery risk 25% per release cycle.</w:t>
+        <w:t>Directed program management and test strategy governance across 3 concurrent product workstreams — applying strong analytical and critical thinking to create and adhere to project management processes that reduced defect escape rate ~20% and delivery risk 25% per release cycle.</w:t>
       </w:r>
     </w:p>
     <w:p>
@@ -380,7 +260,42 @@
           <w:rFonts w:ascii="Arial" w:eastAsia="Arial" w:hAnsi="Arial" w:cs="Arial"/>
           <w:color w:val="222222"/>
         </w:rPr>
-        <w:t>Building a proof-of-concept Python automation framework to extend test coverage and support ongoing quality standards evaluation across sprint cycles.</w:t>
+        <w:t xml:space="preserve">Self-starter driving a proof-of-concept </w:t>
+      </w:r>
+      <w:r>
+        <w:rPr>
+          <w:rFonts w:ascii="Arial" w:eastAsia="Arial" w:hAnsi="Arial" w:cs="Arial"/>
+          <w:color w:val="222222"/>
+        </w:rPr>
+        <w:t>Sel</w:t>
+      </w:r>
+      <w:r>
+        <w:rPr>
+          <w:rFonts w:ascii="Arial" w:eastAsia="Arial" w:hAnsi="Arial" w:cs="Arial"/>
+          <w:color w:val="222222"/>
+        </w:rPr>
+        <w:t>enium</w:t>
+      </w:r>
+      <w:r>
+        <w:rPr>
+          <w:rFonts w:ascii="Arial" w:eastAsia="Arial" w:hAnsi="Arial" w:cs="Arial"/>
+          <w:color w:val="222222"/>
+        </w:rPr>
+        <w:t xml:space="preserve"> automation framework</w:t>
+      </w:r>
+      <w:r>
+        <w:rPr>
+          <w:rFonts w:ascii="Arial" w:eastAsia="Arial" w:hAnsi="Arial" w:cs="Arial"/>
+          <w:color w:val="222222"/>
+        </w:rPr>
+        <w:t xml:space="preserve">. </w:t>
+      </w:r>
+      <w:r>
+        <w:rPr>
+          <w:rFonts w:ascii="Arial" w:eastAsia="Arial" w:hAnsi="Arial" w:cs="Arial"/>
+          <w:color w:val="222222"/>
+        </w:rPr>
+        <w:t xml:space="preserve"> </w:t>
       </w:r>
     </w:p>
     <w:p>
@@ -399,32 +314,14 @@
           <w:sz w:val="22"/>
           <w:szCs w:val="22"/>
         </w:rPr>
-        <w:t xml:space="preserve">Capco </w:t>
-      </w:r>
-      <w:r>
-        <w:rPr>
-          <w:rFonts w:ascii="Arial" w:eastAsia="Arial" w:hAnsi="Arial" w:cs="Arial"/>
-          <w:b/>
-          <w:bCs/>
-          <w:color w:val="000000"/>
-          <w:sz w:val="22"/>
-          <w:szCs w:val="22"/>
-        </w:rPr>
-        <w:t>Consulting</w:t>
+        <w:t>Capco Consulting</w:t>
       </w:r>
       <w:r>
         <w:rPr>
           <w:rFonts w:ascii="Arial" w:eastAsia="Arial" w:hAnsi="Arial" w:cs="Arial"/>
           <w:color w:val="555555"/>
         </w:rPr>
-        <w:t xml:space="preserve"> | Houston</w:t>
-      </w:r>
-      <w:r>
-        <w:rPr>
-          <w:rFonts w:ascii="Arial" w:eastAsia="Arial" w:hAnsi="Arial" w:cs="Arial"/>
-          <w:color w:val="555555"/>
-        </w:rPr>
-        <w:t>, TX</w:t>
+        <w:t xml:space="preserve"> | Houston, TX</w:t>
       </w:r>
       <w:r>
         <w:rPr>
@@ -467,21 +364,7 @@
           <w:rFonts w:ascii="Arial" w:eastAsia="Arial" w:hAnsi="Arial" w:cs="Arial"/>
           <w:color w:val="222222"/>
         </w:rPr>
-        <w:t xml:space="preserve">Drove program management across two cross-functional teams (20+ members) for a Tier 1 investment bank ($66.1B </w:t>
-      </w:r>
-      <w:r>
-        <w:rPr>
-          <w:rFonts w:ascii="Arial" w:eastAsia="Arial" w:hAnsi="Arial" w:cs="Arial"/>
-          <w:color w:val="222222"/>
-        </w:rPr>
-        <w:t>revenue)</w:t>
-      </w:r>
-      <w:r>
-        <w:rPr>
-          <w:rFonts w:ascii="Arial" w:eastAsia="Arial" w:hAnsi="Arial" w:cs="Arial"/>
-          <w:color w:val="222222"/>
-        </w:rPr>
-        <w:t xml:space="preserve"> owning implementation plans, stakeholder engagement, and monitoring/reporting against delivery milestones.</w:t>
+        <w:t>Drove program management across two cross-functional teams (20+ members) for a Tier 1 investment bank ($66.1B revenue) owning implementation plans, stakeholder engagement, and monitoring/reporting against delivery milestones.</w:t>
       </w:r>
     </w:p>
     <w:p>
@@ -505,21 +388,14 @@
           <w:rFonts w:ascii="Arial" w:eastAsia="Arial" w:hAnsi="Arial" w:cs="Arial"/>
           <w:color w:val="222222"/>
         </w:rPr>
-        <w:t>neutralize</w:t>
-      </w:r>
-      <w:r>
-        <w:rPr>
-          <w:rFonts w:ascii="Arial" w:eastAsia="Arial" w:hAnsi="Arial" w:cs="Arial"/>
-          <w:color w:val="222222"/>
-        </w:rPr>
-        <w:t xml:space="preserve">d </w:t>
-      </w:r>
-      <w:r>
-        <w:rPr>
-          <w:rFonts w:ascii="Arial" w:eastAsia="Arial" w:hAnsi="Arial" w:cs="Arial"/>
-          <w:color w:val="222222"/>
-        </w:rPr>
-        <w:t>$10M+ in potential fines — a direct example of financial impact analysis informing quality standards and compliance recommendations.</w:t>
+        <w:t>avoided</w:t>
+      </w:r>
+      <w:r>
+        <w:rPr>
+          <w:rFonts w:ascii="Arial" w:eastAsia="Arial" w:hAnsi="Arial" w:cs="Arial"/>
+          <w:color w:val="222222"/>
+        </w:rPr>
+        <w:t xml:space="preserve"> $10M+ in potential fines.</w:t>
       </w:r>
     </w:p>
     <w:p>
@@ -536,7 +412,14 @@
           <w:rFonts w:ascii="Arial" w:eastAsia="Arial" w:hAnsi="Arial" w:cs="Arial"/>
           <w:color w:val="222222"/>
         </w:rPr>
-        <w:t>Produced communications plans and C-suite reporting packages that compressed funding approval cycle time by ~2 weeks per initiative, demonstrating ability to translate complex program status for senior stakeholders.</w:t>
+        <w:t>Produced communications plans and C-suite reporting packages</w:t>
+      </w:r>
+      <w:r>
+        <w:rPr>
+          <w:rFonts w:ascii="Arial" w:eastAsia="Arial" w:hAnsi="Arial" w:cs="Arial"/>
+          <w:color w:val="222222"/>
+        </w:rPr>
+        <w:t>.</w:t>
       </w:r>
     </w:p>
     <w:p>
@@ -572,32 +455,14 @@
           <w:sz w:val="22"/>
           <w:szCs w:val="22"/>
         </w:rPr>
-        <w:t xml:space="preserve">Trilogy Education / Rice </w:t>
-      </w:r>
-      <w:r>
-        <w:rPr>
-          <w:rFonts w:ascii="Arial" w:eastAsia="Arial" w:hAnsi="Arial" w:cs="Arial"/>
-          <w:b/>
-          <w:bCs/>
-          <w:color w:val="000000"/>
-          <w:sz w:val="22"/>
-          <w:szCs w:val="22"/>
-        </w:rPr>
-        <w:t>University</w:t>
+        <w:t>Trilogy Education / Rice University</w:t>
       </w:r>
       <w:r>
         <w:rPr>
           <w:rFonts w:ascii="Arial" w:eastAsia="Arial" w:hAnsi="Arial" w:cs="Arial"/>
           <w:color w:val="555555"/>
         </w:rPr>
-        <w:t xml:space="preserve"> | Houston</w:t>
-      </w:r>
-      <w:r>
-        <w:rPr>
-          <w:rFonts w:ascii="Arial" w:eastAsia="Arial" w:hAnsi="Arial" w:cs="Arial"/>
-          <w:color w:val="555555"/>
-        </w:rPr>
-        <w:t>, TX</w:t>
+        <w:t xml:space="preserve"> | Houston, TX</w:t>
       </w:r>
       <w:r>
         <w:rPr>
@@ -659,32 +524,14 @@
           <w:sz w:val="22"/>
           <w:szCs w:val="22"/>
         </w:rPr>
-        <w:t xml:space="preserve">JP Morgan Chase </w:t>
-      </w:r>
-      <w:r>
-        <w:rPr>
-          <w:rFonts w:ascii="Arial" w:eastAsia="Arial" w:hAnsi="Arial" w:cs="Arial"/>
-          <w:b/>
-          <w:bCs/>
-          <w:color w:val="000000"/>
-          <w:sz w:val="22"/>
-          <w:szCs w:val="22"/>
-        </w:rPr>
-        <w:t>Bank</w:t>
+        <w:t>JP Morgan Chase Bank</w:t>
       </w:r>
       <w:r>
         <w:rPr>
           <w:rFonts w:ascii="Arial" w:eastAsia="Arial" w:hAnsi="Arial" w:cs="Arial"/>
           <w:color w:val="555555"/>
         </w:rPr>
-        <w:t xml:space="preserve"> | Houston</w:t>
-      </w:r>
-      <w:r>
-        <w:rPr>
-          <w:rFonts w:ascii="Arial" w:eastAsia="Arial" w:hAnsi="Arial" w:cs="Arial"/>
-          <w:color w:val="555555"/>
-        </w:rPr>
-        <w:t>, TX</w:t>
+        <w:t xml:space="preserve"> | Houston, TX</w:t>
       </w:r>
       <w:r>
         <w:rPr>
@@ -761,7 +608,6 @@
           <w:rFonts w:ascii="Arial" w:eastAsia="Arial" w:hAnsi="Arial" w:cs="Arial"/>
           <w:color w:val="222222"/>
         </w:rPr>
-        <w:lastRenderedPageBreak/>
         <w:t>Reduced release management costs by $200K through redesigned process flows, RAID log governance, and financial impact analysis driving risk remediation decisions.</w:t>
       </w:r>
     </w:p>
@@ -771,8 +617,6 @@
           <w:tab w:val="right" w:pos="9026"/>
         </w:tabs>
         <w:spacing w:before="120" w:after="30"/>
-      </w:pPr>
-      <w:r>
         <w:rPr>
           <w:rFonts w:ascii="Arial" w:eastAsia="Arial" w:hAnsi="Arial" w:cs="Arial"/>
           <w:b/>
@@ -781,8 +625,15 @@
           <w:sz w:val="22"/>
           <w:szCs w:val="22"/>
         </w:rPr>
-        <w:t xml:space="preserve">Makpar Corporation (IRS </w:t>
-      </w:r>
+      </w:pPr>
+    </w:p>
+    <w:p>
+      <w:pPr>
+        <w:tabs>
+          <w:tab w:val="right" w:pos="9026"/>
+        </w:tabs>
+        <w:spacing w:before="120" w:after="30"/>
+      </w:pPr>
       <w:r>
         <w:rPr>
           <w:rFonts w:ascii="Arial" w:eastAsia="Arial" w:hAnsi="Arial" w:cs="Arial"/>
@@ -792,21 +643,15 @@
           <w:sz w:val="22"/>
           <w:szCs w:val="22"/>
         </w:rPr>
-        <w:t>eAuthentication)</w:t>
+        <w:lastRenderedPageBreak/>
+        <w:t>Makpar Corporation (IRS eAuthentication)</w:t>
       </w:r>
       <w:r>
         <w:rPr>
           <w:rFonts w:ascii="Arial" w:eastAsia="Arial" w:hAnsi="Arial" w:cs="Arial"/>
           <w:color w:val="555555"/>
         </w:rPr>
-        <w:t xml:space="preserve"> | Lanham</w:t>
-      </w:r>
-      <w:r>
-        <w:rPr>
-          <w:rFonts w:ascii="Arial" w:eastAsia="Arial" w:hAnsi="Arial" w:cs="Arial"/>
-          <w:color w:val="555555"/>
-        </w:rPr>
-        <w:t>, MD</w:t>
+        <w:t xml:space="preserve"> | Lanham, MD</w:t>
       </w:r>
       <w:r>
         <w:rPr>
@@ -849,35 +694,7 @@
           <w:rFonts w:ascii="Arial" w:eastAsia="Arial" w:hAnsi="Arial" w:cs="Arial"/>
           <w:color w:val="222222"/>
         </w:rPr>
-        <w:t>Directed business analysis</w:t>
-      </w:r>
-      <w:r>
-        <w:rPr>
-          <w:rFonts w:ascii="Arial" w:eastAsia="Arial" w:hAnsi="Arial" w:cs="Arial"/>
-          <w:color w:val="222222"/>
-        </w:rPr>
-        <w:t xml:space="preserve"> &amp;</w:t>
-      </w:r>
-      <w:r>
-        <w:rPr>
-          <w:rFonts w:ascii="Arial" w:eastAsia="Arial" w:hAnsi="Arial" w:cs="Arial"/>
-          <w:color w:val="222222"/>
-        </w:rPr>
-        <w:t xml:space="preserve"> delivery oversight for a mission-critical federal platform (651M+ annual </w:t>
-      </w:r>
-      <w:r>
-        <w:rPr>
-          <w:rFonts w:ascii="Arial" w:eastAsia="Arial" w:hAnsi="Arial" w:cs="Arial"/>
-          <w:color w:val="222222"/>
-        </w:rPr>
-        <w:t>users)</w:t>
-      </w:r>
-      <w:r>
-        <w:rPr>
-          <w:rFonts w:ascii="Arial" w:eastAsia="Arial" w:hAnsi="Arial" w:cs="Arial"/>
-          <w:color w:val="222222"/>
-        </w:rPr>
-        <w:t xml:space="preserve"> </w:t>
+        <w:t xml:space="preserve">Directed business analysis &amp; delivery oversight for a mission-critical federal platform (651M+ annual users) </w:t>
       </w:r>
     </w:p>
     <w:p>
@@ -894,7 +711,7 @@
           <w:rFonts w:ascii="Arial" w:eastAsia="Arial" w:hAnsi="Arial" w:cs="Arial"/>
           <w:color w:val="222222"/>
         </w:rPr>
-        <w:t>Led fraud prevention analysis and process design for federal compliance, contributing to ~35-40% reduction in fraudulent access — demonstrating quality standards evaluation and recommendations in a public sector context.</w:t>
+        <w:t xml:space="preserve">Led fraud prevention analysis and process design for federal compliance, contributing to ~35-40% reduction in fraudulent access </w:t>
       </w:r>
     </w:p>
     <w:p>
@@ -930,39 +747,14 @@
           <w:sz w:val="22"/>
           <w:szCs w:val="22"/>
         </w:rPr>
-        <w:t xml:space="preserve">Deloitte </w:t>
-      </w:r>
-      <w:r>
-        <w:rPr>
-          <w:rFonts w:ascii="Arial" w:eastAsia="Arial" w:hAnsi="Arial" w:cs="Arial"/>
-          <w:b/>
-          <w:bCs/>
-          <w:color w:val="000000"/>
-          <w:sz w:val="22"/>
-          <w:szCs w:val="22"/>
-        </w:rPr>
-        <w:t>Consulting</w:t>
+        <w:t>Deloitte Consulting</w:t>
       </w:r>
       <w:r>
         <w:rPr>
           <w:rFonts w:ascii="Arial" w:eastAsia="Arial" w:hAnsi="Arial" w:cs="Arial"/>
           <w:color w:val="555555"/>
         </w:rPr>
-        <w:t xml:space="preserve"> </w:t>
-      </w:r>
-      <w:r>
-        <w:rPr>
-          <w:rFonts w:ascii="Arial" w:eastAsia="Arial" w:hAnsi="Arial" w:cs="Arial"/>
-          <w:color w:val="555555"/>
-        </w:rPr>
-        <w:t>| New</w:t>
-      </w:r>
-      <w:r>
-        <w:rPr>
-          <w:rFonts w:ascii="Arial" w:eastAsia="Arial" w:hAnsi="Arial" w:cs="Arial"/>
-          <w:color w:val="555555"/>
-        </w:rPr>
-        <w:t xml:space="preserve"> York, NY</w:t>
+        <w:t xml:space="preserve"> | New York, NY</w:t>
       </w:r>
       <w:r>
         <w:rPr>
@@ -1005,7 +797,7 @@
           <w:rFonts w:ascii="Arial" w:eastAsia="Arial" w:hAnsi="Arial" w:cs="Arial"/>
           <w:color w:val="222222"/>
         </w:rPr>
-        <w:t>Drove PMO delivery on a $50M financial services transformation — directing 6 concurrent project streams, owning implementation plans, executive reporting, communications strategy, and QA leadership.</w:t>
+        <w:t>Drove PMO delivery on a $50M financial services transformation in a professional services firm environment — directing 6 concurrent project streams, owning implementation plans, executive reporting, communications strategy, and QA leadership, leveraging advanced PowerPoint and Excel for stakeholder presentations and financial impact reporting.</w:t>
       </w:r>
     </w:p>
     <w:p>
@@ -1022,21 +814,7 @@
           <w:rFonts w:ascii="Arial" w:eastAsia="Arial" w:hAnsi="Arial" w:cs="Arial"/>
           <w:color w:val="222222"/>
         </w:rPr>
-        <w:t xml:space="preserve">Led state benefits modernization programs (Massachusetts, </w:t>
-      </w:r>
-      <w:r>
-        <w:rPr>
-          <w:rFonts w:ascii="Arial" w:eastAsia="Arial" w:hAnsi="Arial" w:cs="Arial"/>
-          <w:color w:val="222222"/>
-        </w:rPr>
-        <w:t>Wisconsin)</w:t>
-      </w:r>
-      <w:r>
-        <w:rPr>
-          <w:rFonts w:ascii="Arial" w:eastAsia="Arial" w:hAnsi="Arial" w:cs="Arial"/>
-          <w:color w:val="222222"/>
-        </w:rPr>
-        <w:t xml:space="preserve"> governing ACA, WIC, and Wisconsin CARES eligibility platform implementations from requirements through UAT</w:t>
+        <w:t>Led state benefits modernization programs (Massachusetts, Wisconsin) governing ACA, WIC, and Wisconsin CARES eligibility platform implementations from requirements through UAT</w:t>
       </w:r>
     </w:p>
     <w:p>
@@ -1070,108 +848,21 @@
           <w:rFonts w:ascii="Arial" w:eastAsia="Arial" w:hAnsi="Arial" w:cs="Arial"/>
           <w:color w:val="222222"/>
         </w:rPr>
-        <w:t>Built Deloitte's internal PM/Testing Center of Excellence, authoring firm-wide governance standards — demonstrating program management consulting at scale.</w:t>
-      </w:r>
-    </w:p>
-    <w:p>
-      <w:pPr>
-        <w:tabs>
-          <w:tab w:val="right" w:pos="9026"/>
-        </w:tabs>
-        <w:spacing w:before="120" w:after="30"/>
-      </w:pPr>
-      <w:r>
-        <w:rPr>
-          <w:rFonts w:ascii="Arial" w:eastAsia="Arial" w:hAnsi="Arial" w:cs="Arial"/>
-          <w:b/>
-          <w:bCs/>
-          <w:color w:val="000000"/>
-          <w:sz w:val="22"/>
-          <w:szCs w:val="22"/>
-        </w:rPr>
-        <w:t xml:space="preserve">Alliance Global Services </w:t>
-      </w:r>
-      <w:r>
-        <w:rPr>
-          <w:rFonts w:ascii="Arial" w:eastAsia="Arial" w:hAnsi="Arial" w:cs="Arial"/>
-          <w:b/>
-          <w:bCs/>
-          <w:color w:val="000000"/>
-          <w:sz w:val="22"/>
-          <w:szCs w:val="22"/>
-        </w:rPr>
-        <w:t>Consulting</w:t>
-      </w:r>
-      <w:r>
-        <w:rPr>
-          <w:rFonts w:ascii="Arial" w:eastAsia="Arial" w:hAnsi="Arial" w:cs="Arial"/>
-          <w:color w:val="555555"/>
-        </w:rPr>
-        <w:t xml:space="preserve"> </w:t>
-      </w:r>
-      <w:r>
-        <w:rPr>
-          <w:rFonts w:ascii="Arial" w:eastAsia="Arial" w:hAnsi="Arial" w:cs="Arial"/>
-          <w:color w:val="555555"/>
-        </w:rPr>
-        <w:t>| New</w:t>
-      </w:r>
-      <w:r>
-        <w:rPr>
-          <w:rFonts w:ascii="Arial" w:eastAsia="Arial" w:hAnsi="Arial" w:cs="Arial"/>
-          <w:color w:val="555555"/>
-        </w:rPr>
-        <w:t xml:space="preserve"> York, NY</w:t>
-      </w:r>
-      <w:r>
-        <w:rPr>
-          <w:rFonts w:ascii="Arial" w:eastAsia="Arial" w:hAnsi="Arial" w:cs="Arial"/>
-          <w:color w:val="555555"/>
-        </w:rPr>
-        <w:tab/>
-        <w:t>February 2010 – November 2010</w:t>
-      </w:r>
-    </w:p>
-    <w:p>
-      <w:pPr>
-        <w:spacing w:after="50"/>
-      </w:pPr>
-      <w:r>
-        <w:rPr>
-          <w:rFonts w:ascii="Arial" w:eastAsia="Arial" w:hAnsi="Arial" w:cs="Arial"/>
-          <w:b/>
-          <w:bCs/>
-          <w:i/>
-          <w:iCs/>
-          <w:color w:val="222222"/>
-          <w:sz w:val="21"/>
-          <w:szCs w:val="21"/>
-        </w:rPr>
-        <w:t>Sr. Project Manager / Testing Lead</w:t>
-      </w:r>
-    </w:p>
-    <w:p>
-      <w:pPr>
-        <w:pStyle w:val="ListParagraph"/>
-        <w:numPr>
-          <w:ilvl w:val="0"/>
-          <w:numId w:val="2"/>
-        </w:numPr>
-        <w:spacing w:after="40"/>
-      </w:pPr>
-      <w:r>
-        <w:rPr>
-          <w:rFonts w:ascii="Arial" w:eastAsia="Arial" w:hAnsi="Arial" w:cs="Arial"/>
-          <w:color w:val="222222"/>
-        </w:rPr>
-        <w:t>Owned end-to-end QA program management for a trade blotter application used by 300+ Merrill Lynch traders — avoiding an estimated $700K in pre-launch trading errors</w:t>
-      </w:r>
-      <w:r>
-        <w:rPr>
-          <w:rFonts w:ascii="Arial" w:eastAsia="Arial" w:hAnsi="Arial" w:cs="Arial"/>
-          <w:color w:val="222222"/>
-        </w:rPr>
-        <w:t>.</w:t>
+        <w:t xml:space="preserve">A national lead </w:t>
+      </w:r>
+      <w:r>
+        <w:rPr>
+          <w:rFonts w:ascii="Arial" w:eastAsia="Arial" w:hAnsi="Arial" w:cs="Arial"/>
+          <w:color w:val="222222"/>
+        </w:rPr>
+        <w:t>for Deloitte’s</w:t>
+      </w:r>
+      <w:r>
+        <w:rPr>
+          <w:rFonts w:ascii="Arial" w:eastAsia="Arial" w:hAnsi="Arial" w:cs="Arial"/>
+          <w:color w:val="222222"/>
+        </w:rPr>
+        <w:t xml:space="preserve"> internal PM/Testing Center of Excellence.</w:t>
       </w:r>
     </w:p>
     <w:p>
@@ -1216,25 +907,7 @@
           <w:sz w:val="21"/>
           <w:szCs w:val="21"/>
         </w:rPr>
-        <w:t xml:space="preserve">AI-ENHANCED PRODUCTIVITY &amp; MOBILE APPLICATION INITIATIVE </w:t>
-      </w:r>
-      <w:r>
-        <w:rPr>
-          <w:rFonts w:ascii="Arial" w:eastAsia="Arial" w:hAnsi="Arial"/>
-          <w:b/>
-          <w:sz w:val="21"/>
-          <w:szCs w:val="21"/>
-        </w:rPr>
-        <w:t>-</w:t>
-      </w:r>
-      <w:r>
-        <w:rPr>
-          <w:rFonts w:ascii="Arial" w:eastAsia="Arial" w:hAnsi="Arial"/>
-          <w:b/>
-          <w:sz w:val="21"/>
-          <w:szCs w:val="21"/>
-        </w:rPr>
-        <w:t xml:space="preserve"> Founder / Builder | 2025–Present</w:t>
+        <w:t>AI-ENHANCED PRODUCTIVITY &amp; MOBILE APPLICATION INITIATIVE - Founder / Builder | 2025–Present</w:t>
       </w:r>
     </w:p>
     <w:p>
@@ -1327,8 +1000,37 @@
           <w:sz w:val="22"/>
           <w:szCs w:val="22"/>
         </w:rPr>
-        <w:t>E</w:t>
-      </w:r>
+        <w:t>EDUCATION</w:t>
+      </w:r>
+    </w:p>
+    <w:p>
+      <w:pPr>
+        <w:spacing w:after="60"/>
+      </w:pPr>
+      <w:r>
+        <w:rPr>
+          <w:rFonts w:ascii="Arial" w:eastAsia="Arial" w:hAnsi="Arial" w:cs="Arial"/>
+          <w:color w:val="222222"/>
+        </w:rPr>
+        <w:t>Rice University, Houston TX — B.S.E.E., Electrical and Computer Engineering</w:t>
+      </w:r>
+    </w:p>
+    <w:p>
+      <w:pPr>
+        <w:spacing w:after="60"/>
+      </w:pPr>
+      <w:r>
+        <w:rPr>
+          <w:rFonts w:ascii="Arial" w:eastAsia="Arial" w:hAnsi="Arial" w:cs="Arial"/>
+          <w:color w:val="222222"/>
+        </w:rPr>
+        <w:t>Texas Southern University, Houston TX — B.S., Physics</w:t>
+      </w:r>
+    </w:p>
+    <w:p>
+      <w:pPr>
+        <w:spacing w:before="160" w:after="60"/>
+      </w:pPr>
       <w:r>
         <w:rPr>
           <w:rFonts w:ascii="Arial" w:eastAsia="Arial" w:hAnsi="Arial" w:cs="Arial"/>
@@ -1338,7 +1040,7 @@
           <w:sz w:val="22"/>
           <w:szCs w:val="22"/>
         </w:rPr>
-        <w:t>DUCATION</w:t>
+        <w:t>CERTIFICATIONS &amp; TOOLS</w:t>
       </w:r>
     </w:p>
     <w:p>
@@ -1350,7 +1052,7 @@
           <w:rFonts w:ascii="Arial" w:eastAsia="Arial" w:hAnsi="Arial" w:cs="Arial"/>
           <w:color w:val="222222"/>
         </w:rPr>
-        <w:t>Rice University, Houston TX — B.S.E.E., Electrical and Computer Engineering</w:t>
+        <w:t>PMP (exp. June 2026)  ·  Certified Scrum Master (CSM) · SAFe POPM · SAFe Lean-Agile · Microsoft Azure ·  Generative AI · AWS AI Foundational (exp. July 2026)</w:t>
       </w:r>
     </w:p>
     <w:p>
@@ -1362,386 +1064,13 @@
           <w:rFonts w:ascii="Arial" w:eastAsia="Arial" w:hAnsi="Arial" w:cs="Arial"/>
           <w:color w:val="222222"/>
         </w:rPr>
-        <w:t>Texas Southern University, Houston TX — B.S., Physics</w:t>
-      </w:r>
-    </w:p>
-    <w:p>
-      <w:pPr>
-        <w:spacing w:before="160" w:after="60"/>
-      </w:pPr>
-      <w:r>
-        <w:rPr>
-          <w:rFonts w:ascii="Arial" w:eastAsia="Arial" w:hAnsi="Arial" w:cs="Arial"/>
-          <w:b/>
-          <w:bCs/>
-          <w:color w:val="2E74B5"/>
-          <w:sz w:val="22"/>
-          <w:szCs w:val="22"/>
-        </w:rPr>
-        <w:t>CERTIFICATIONS &amp; TOOLS</w:t>
+        <w:t>MS Office (Excel — Advanced · PowerPoint — Advanced · Teams · Word · Outlook) · JIRA · MS Project · Smartsheet · Confluence · Power BI · SharePoint · Selenium · Visio · ClickUp · IBM CLM · GitHub · MS 365 · Claude · Gemini · Agentic AI</w:t>
       </w:r>
     </w:p>
     <w:p>
       <w:pPr>
         <w:spacing w:after="60"/>
       </w:pPr>
-      <w:r>
-        <w:rPr>
-          <w:rFonts w:ascii="Arial" w:eastAsia="Arial" w:hAnsi="Arial" w:cs="Arial"/>
-          <w:color w:val="222222"/>
-        </w:rPr>
-        <w:t>PMP (exp. June 2026</w:t>
-      </w:r>
-      <w:proofErr w:type="gramStart"/>
-      <w:r>
-        <w:rPr>
-          <w:rFonts w:ascii="Arial" w:eastAsia="Arial" w:hAnsi="Arial" w:cs="Arial"/>
-          <w:color w:val="222222"/>
-        </w:rPr>
-        <w:t>)  ·</w:t>
-      </w:r>
-      <w:proofErr w:type="gramEnd"/>
-      <w:r>
-        <w:rPr>
-          <w:rFonts w:ascii="Arial" w:eastAsia="Arial" w:hAnsi="Arial" w:cs="Arial"/>
-          <w:color w:val="222222"/>
-        </w:rPr>
-        <w:t xml:space="preserve">  Certified Scrum Master (</w:t>
-      </w:r>
-      <w:r>
-        <w:rPr>
-          <w:rFonts w:ascii="Arial" w:eastAsia="Arial" w:hAnsi="Arial" w:cs="Arial"/>
-          <w:color w:val="222222"/>
-        </w:rPr>
-        <w:t>CSM) · SAFe</w:t>
-      </w:r>
-      <w:r>
-        <w:rPr>
-          <w:rFonts w:ascii="Arial" w:eastAsia="Arial" w:hAnsi="Arial" w:cs="Arial"/>
-          <w:color w:val="222222"/>
-        </w:rPr>
-        <w:t xml:space="preserve"> </w:t>
-      </w:r>
-      <w:r>
-        <w:rPr>
-          <w:rFonts w:ascii="Arial" w:eastAsia="Arial" w:hAnsi="Arial" w:cs="Arial"/>
-          <w:color w:val="222222"/>
-        </w:rPr>
-        <w:t>POPM · SAFe</w:t>
-      </w:r>
-      <w:r>
-        <w:rPr>
-          <w:rFonts w:ascii="Arial" w:eastAsia="Arial" w:hAnsi="Arial" w:cs="Arial"/>
-          <w:color w:val="222222"/>
-        </w:rPr>
-        <w:t xml:space="preserve"> Lean-</w:t>
-      </w:r>
-      <w:r>
-        <w:rPr>
-          <w:rFonts w:ascii="Arial" w:eastAsia="Arial" w:hAnsi="Arial" w:cs="Arial"/>
-          <w:color w:val="222222"/>
-        </w:rPr>
-        <w:t>Agile · Microsoft</w:t>
-      </w:r>
-      <w:r>
-        <w:rPr>
-          <w:rFonts w:ascii="Arial" w:eastAsia="Arial" w:hAnsi="Arial" w:cs="Arial"/>
-          <w:color w:val="222222"/>
-        </w:rPr>
-        <w:t xml:space="preserve"> </w:t>
-      </w:r>
-      <w:r>
-        <w:rPr>
-          <w:rFonts w:ascii="Arial" w:eastAsia="Arial" w:hAnsi="Arial" w:cs="Arial"/>
-          <w:color w:val="222222"/>
-        </w:rPr>
-        <w:t xml:space="preserve">Azure </w:t>
-      </w:r>
-      <w:proofErr w:type="gramStart"/>
-      <w:r>
-        <w:rPr>
-          <w:rFonts w:ascii="Arial" w:eastAsia="Arial" w:hAnsi="Arial" w:cs="Arial"/>
-          <w:color w:val="222222"/>
-        </w:rPr>
-        <w:t>·</w:t>
-      </w:r>
-      <w:r>
-        <w:rPr>
-          <w:rFonts w:ascii="Arial" w:eastAsia="Arial" w:hAnsi="Arial" w:cs="Arial"/>
-          <w:color w:val="222222"/>
-        </w:rPr>
-        <w:t xml:space="preserve">  Generative</w:t>
-      </w:r>
-      <w:proofErr w:type="gramEnd"/>
-      <w:r>
-        <w:rPr>
-          <w:rFonts w:ascii="Arial" w:eastAsia="Arial" w:hAnsi="Arial" w:cs="Arial"/>
-          <w:color w:val="222222"/>
-        </w:rPr>
-        <w:t xml:space="preserve"> </w:t>
-      </w:r>
-      <w:r>
-        <w:rPr>
-          <w:rFonts w:ascii="Arial" w:eastAsia="Arial" w:hAnsi="Arial" w:cs="Arial"/>
-          <w:color w:val="222222"/>
-        </w:rPr>
-        <w:t>AI · AWS</w:t>
-      </w:r>
-      <w:r>
-        <w:rPr>
-          <w:rFonts w:ascii="Arial" w:eastAsia="Arial" w:hAnsi="Arial" w:cs="Arial"/>
-          <w:color w:val="222222"/>
-        </w:rPr>
-        <w:t xml:space="preserve"> AI Foundational (exp. July 2026)</w:t>
-      </w:r>
-    </w:p>
-    <w:p>
-      <w:pPr>
-        <w:spacing w:after="60"/>
-      </w:pPr>
-      <w:r>
-        <w:rPr>
-          <w:rFonts w:ascii="Arial" w:eastAsia="Arial" w:hAnsi="Arial" w:cs="Arial"/>
-          <w:color w:val="222222"/>
-        </w:rPr>
-        <w:t xml:space="preserve">JIRA </w:t>
-      </w:r>
-      <w:r>
-        <w:rPr>
-          <w:rFonts w:ascii="Arial" w:eastAsia="Arial" w:hAnsi="Arial" w:cs="Arial"/>
-          <w:color w:val="222222"/>
-        </w:rPr>
-        <w:t>· MS</w:t>
-      </w:r>
-      <w:r>
-        <w:rPr>
-          <w:rFonts w:ascii="Arial" w:eastAsia="Arial" w:hAnsi="Arial" w:cs="Arial"/>
-          <w:color w:val="222222"/>
-        </w:rPr>
-        <w:t xml:space="preserve"> </w:t>
-      </w:r>
-      <w:r>
-        <w:rPr>
-          <w:rFonts w:ascii="Arial" w:eastAsia="Arial" w:hAnsi="Arial" w:cs="Arial"/>
-          <w:color w:val="222222"/>
-        </w:rPr>
-        <w:t xml:space="preserve">Project </w:t>
-      </w:r>
-      <w:r>
-        <w:rPr>
-          <w:rFonts w:ascii="Arial" w:eastAsia="Arial" w:hAnsi="Arial" w:cs="Arial"/>
-          <w:color w:val="222222"/>
-        </w:rPr>
-        <w:t xml:space="preserve">· </w:t>
-      </w:r>
-      <w:proofErr w:type="gramStart"/>
-      <w:r>
-        <w:rPr>
-          <w:rFonts w:ascii="Arial" w:eastAsia="Arial" w:hAnsi="Arial" w:cs="Arial"/>
-          <w:color w:val="222222"/>
-        </w:rPr>
-        <w:t>Smartsheet</w:t>
-      </w:r>
-      <w:r>
-        <w:rPr>
-          <w:rFonts w:ascii="Arial" w:eastAsia="Arial" w:hAnsi="Arial" w:cs="Arial"/>
-          <w:color w:val="222222"/>
-        </w:rPr>
-        <w:t xml:space="preserve">  ·</w:t>
-      </w:r>
-      <w:proofErr w:type="gramEnd"/>
-      <w:r>
-        <w:rPr>
-          <w:rFonts w:ascii="Arial" w:eastAsia="Arial" w:hAnsi="Arial" w:cs="Arial"/>
-          <w:color w:val="222222"/>
-        </w:rPr>
-        <w:t xml:space="preserve">  </w:t>
-      </w:r>
-      <w:proofErr w:type="gramStart"/>
-      <w:r>
-        <w:rPr>
-          <w:rFonts w:ascii="Arial" w:eastAsia="Arial" w:hAnsi="Arial" w:cs="Arial"/>
-          <w:color w:val="222222"/>
-        </w:rPr>
-        <w:t>Confluence  ·</w:t>
-      </w:r>
-      <w:proofErr w:type="gramEnd"/>
-      <w:r>
-        <w:rPr>
-          <w:rFonts w:ascii="Arial" w:eastAsia="Arial" w:hAnsi="Arial" w:cs="Arial"/>
-          <w:color w:val="222222"/>
-        </w:rPr>
-        <w:t xml:space="preserve">  Power </w:t>
-      </w:r>
-      <w:proofErr w:type="gramStart"/>
-      <w:r>
-        <w:rPr>
-          <w:rFonts w:ascii="Arial" w:eastAsia="Arial" w:hAnsi="Arial" w:cs="Arial"/>
-          <w:color w:val="222222"/>
-        </w:rPr>
-        <w:t>BI  ·</w:t>
-      </w:r>
-      <w:proofErr w:type="gramEnd"/>
-      <w:r>
-        <w:rPr>
-          <w:rFonts w:ascii="Arial" w:eastAsia="Arial" w:hAnsi="Arial" w:cs="Arial"/>
-          <w:color w:val="222222"/>
-        </w:rPr>
-        <w:t xml:space="preserve">  </w:t>
-      </w:r>
-      <w:r>
-        <w:rPr>
-          <w:rFonts w:ascii="Arial" w:eastAsia="Arial" w:hAnsi="Arial" w:cs="Arial"/>
-          <w:color w:val="222222"/>
-        </w:rPr>
-        <w:t xml:space="preserve">SharePoint </w:t>
-      </w:r>
-      <w:proofErr w:type="gramStart"/>
-      <w:r>
-        <w:rPr>
-          <w:rFonts w:ascii="Arial" w:eastAsia="Arial" w:hAnsi="Arial" w:cs="Arial"/>
-          <w:color w:val="222222"/>
-        </w:rPr>
-        <w:t>·</w:t>
-      </w:r>
-      <w:r>
-        <w:rPr>
-          <w:rFonts w:ascii="Arial" w:eastAsia="Arial" w:hAnsi="Arial" w:cs="Arial"/>
-          <w:color w:val="222222"/>
-        </w:rPr>
-        <w:t xml:space="preserve">  Selenium</w:t>
-      </w:r>
-      <w:proofErr w:type="gramEnd"/>
-      <w:r>
-        <w:rPr>
-          <w:rFonts w:ascii="Arial" w:eastAsia="Arial" w:hAnsi="Arial" w:cs="Arial"/>
-          <w:color w:val="222222"/>
-        </w:rPr>
-        <w:t xml:space="preserve">  </w:t>
-      </w:r>
-      <w:proofErr w:type="gramStart"/>
-      <w:r>
-        <w:rPr>
-          <w:rFonts w:ascii="Arial" w:eastAsia="Arial" w:hAnsi="Arial" w:cs="Arial"/>
-          <w:color w:val="222222"/>
-        </w:rPr>
-        <w:t>·  Visio</w:t>
-      </w:r>
-      <w:proofErr w:type="gramEnd"/>
-      <w:r>
-        <w:rPr>
-          <w:rFonts w:ascii="Arial" w:eastAsia="Arial" w:hAnsi="Arial" w:cs="Arial"/>
-          <w:color w:val="222222"/>
-        </w:rPr>
-        <w:t xml:space="preserve">  </w:t>
-      </w:r>
-      <w:r>
-        <w:rPr>
-          <w:rFonts w:ascii="Arial" w:eastAsia="Arial" w:hAnsi="Arial" w:cs="Arial"/>
-          <w:color w:val="222222"/>
-        </w:rPr>
-        <w:t xml:space="preserve">· </w:t>
-      </w:r>
-      <w:proofErr w:type="gramStart"/>
-      <w:r>
-        <w:rPr>
-          <w:rFonts w:ascii="Arial" w:eastAsia="Arial" w:hAnsi="Arial" w:cs="Arial"/>
-          <w:color w:val="222222"/>
-        </w:rPr>
-        <w:t>ClickUp</w:t>
-      </w:r>
-      <w:r>
-        <w:rPr>
-          <w:rFonts w:ascii="Arial" w:eastAsia="Arial" w:hAnsi="Arial" w:cs="Arial"/>
-          <w:color w:val="222222"/>
-        </w:rPr>
-        <w:t xml:space="preserve">  ·</w:t>
-      </w:r>
-      <w:proofErr w:type="gramEnd"/>
-      <w:r>
-        <w:rPr>
-          <w:rFonts w:ascii="Arial" w:eastAsia="Arial" w:hAnsi="Arial" w:cs="Arial"/>
-          <w:color w:val="222222"/>
-        </w:rPr>
-        <w:t xml:space="preserve">  IBM CLM</w:t>
-      </w:r>
-      <w:r>
-        <w:rPr>
-          <w:rFonts w:ascii="Arial" w:eastAsia="Arial" w:hAnsi="Arial" w:cs="Arial"/>
-          <w:color w:val="222222"/>
-        </w:rPr>
-        <w:t xml:space="preserve"> – Cursor – Claude – Canva – Gemini – Genspark </w:t>
-      </w:r>
-      <w:r>
-        <w:rPr>
-          <w:rFonts w:ascii="Arial" w:eastAsia="Arial" w:hAnsi="Arial" w:cs="Arial"/>
-          <w:color w:val="222222"/>
-        </w:rPr>
-        <w:t>-GitHub</w:t>
-      </w:r>
-      <w:r>
-        <w:rPr>
-          <w:rFonts w:ascii="Arial" w:eastAsia="Arial" w:hAnsi="Arial" w:cs="Arial"/>
-          <w:color w:val="222222"/>
-        </w:rPr>
-        <w:t xml:space="preserve"> – MS 365 – Agentic AI</w:t>
-      </w:r>
-    </w:p>
-    <w:p>
-      <w:pPr>
-        <w:spacing w:before="160" w:after="60"/>
-      </w:pPr>
-      <w:r>
-        <w:rPr>
-          <w:rFonts w:ascii="Arial" w:eastAsia="Arial" w:hAnsi="Arial" w:cs="Arial"/>
-          <w:b/>
-          <w:bCs/>
-          <w:color w:val="2E74B5"/>
-          <w:sz w:val="22"/>
-          <w:szCs w:val="22"/>
-        </w:rPr>
-        <w:t>PUBLICATIONS</w:t>
-      </w:r>
-    </w:p>
-    <w:p>
-      <w:pPr>
-        <w:spacing w:after="60"/>
-      </w:pPr>
-      <w:r>
-        <w:rPr>
-          <w:rFonts w:ascii="Arial" w:eastAsia="Arial" w:hAnsi="Arial" w:cs="Arial"/>
-          <w:color w:val="222222"/>
-        </w:rPr>
-        <w:t>Sports Data Analytics — Quantitative Historical Analysis, Chance Magazine (peer-reviewed)</w:t>
-      </w:r>
-    </w:p>
-    <w:p>
-      <w:pPr>
-        <w:spacing w:after="60"/>
-      </w:pPr>
-      <w:r>
-        <w:rPr>
-          <w:rFonts w:ascii="Arial" w:eastAsia="Arial" w:hAnsi="Arial" w:cs="Arial"/>
-          <w:color w:val="222222"/>
-        </w:rPr>
-        <w:t xml:space="preserve">White Paper: "Proactive Design Solutions for Retroactive Batch Processing in Benefit </w:t>
-      </w:r>
-      <w:proofErr w:type="gramStart"/>
-      <w:r>
-        <w:rPr>
-          <w:rFonts w:ascii="Arial" w:eastAsia="Arial" w:hAnsi="Arial" w:cs="Arial"/>
-          <w:color w:val="222222"/>
-        </w:rPr>
-        <w:t>Systems" —</w:t>
-      </w:r>
-      <w:proofErr w:type="gramEnd"/>
-      <w:r>
-        <w:rPr>
-          <w:rFonts w:ascii="Arial" w:eastAsia="Arial" w:hAnsi="Arial" w:cs="Arial"/>
-          <w:color w:val="222222"/>
-        </w:rPr>
-        <w:t xml:space="preserve"> Deloitte (adopted as PMO governance reference across public sector engagements)</w:t>
-      </w:r>
     </w:p>
     <w:sectPr>
       <w:pgSz w:w="12240" w:h="15840"/>

</xml_diff>